<commit_message>
Fit reconciliation letter template within two A4 pages
Co-authored-by: Meganheee <Meganheee@users.noreply.github.com>
</commit_message>
<xml_diff>
--- a/HK_Statement_of_Account_Reconciliation_Template.docx
+++ b/HK_Statement_of_Account_Reconciliation_Template.docx
@@ -4,55 +4,73 @@
   <w:body>
     <w:p>
       <w:pPr>
-        <w:pStyle w:val="Title"/>
+        <w:spacing w:after="40" w:before="0" w:lineRule="auto" w:line="259"/>
         <w:jc w:val="center"/>
       </w:pPr>
       <w:r>
+        <w:rPr>
+          <w:rFonts w:ascii="PMingLiU" w:hAnsi="PMingLiU" w:eastAsia="PMingLiU"/>
+          <w:b/>
+          <w:sz w:val="30"/>
+        </w:rPr>
         <w:t>對賬函</w:t>
       </w:r>
     </w:p>
     <w:p>
       <w:pPr>
+        <w:spacing w:after="40" w:before="0" w:lineRule="auto" w:line="259"/>
         <w:jc w:val="center"/>
       </w:pPr>
       <w:r>
         <w:rPr>
           <w:rFonts w:ascii="Times New Roman" w:hAnsi="Times New Roman" w:eastAsia="PMingLiU"/>
           <w:b/>
-          <w:sz w:val="24"/>
+          <w:sz w:val="21"/>
         </w:rPr>
         <w:t>Statement of Account / Reconciliation Letter</w:t>
       </w:r>
     </w:p>
-    <w:p/>
     <w:tbl>
       <w:tblPr>
         <w:tblW w:type="auto" w:w="0"/>
-        <w:tblLayout w:type="autofit"/>
         <w:tblLook w:firstColumn="1" w:firstRow="1" w:lastColumn="0" w:lastRow="0" w:noHBand="0" w:noVBand="1" w:val="04A0"/>
       </w:tblPr>
       <w:tblGrid>
-        <w:gridCol w:w="4703"/>
-        <w:gridCol w:w="4703"/>
+        <w:gridCol w:w="4986"/>
+        <w:gridCol w:w="4986"/>
       </w:tblGrid>
       <w:tr>
         <w:tc>
           <w:tcPr>
-            <w:tcW w:type="dxa" w:w="4703"/>
+            <w:tcW w:type="dxa" w:w="4986"/>
             <w:shd w:fill="E7E6E6"/>
           </w:tcPr>
           <w:p>
+            <w:pPr>
+              <w:spacing w:before="0" w:after="0" w:lineRule="auto" w:line="252"/>
+            </w:pPr>
             <w:r>
+              <w:rPr>
+                <w:rFonts w:ascii="PMingLiU" w:hAnsi="PMingLiU" w:eastAsia="PMingLiU"/>
+                <w:sz w:val="17"/>
+              </w:rPr>
               <w:t>Our Ref. 本函編號</w:t>
             </w:r>
           </w:p>
         </w:tc>
         <w:tc>
           <w:tcPr>
-            <w:tcW w:type="dxa" w:w="4703"/>
+            <w:tcW w:type="dxa" w:w="4986"/>
           </w:tcPr>
           <w:p>
+            <w:pPr>
+              <w:spacing w:before="0" w:after="0" w:lineRule="auto" w:line="252"/>
+            </w:pPr>
             <w:r>
+              <w:rPr>
+                <w:rFonts w:ascii="PMingLiU" w:hAnsi="PMingLiU" w:eastAsia="PMingLiU"/>
+                <w:sz w:val="17"/>
+              </w:rPr>
               <w:t>AR-REC-2026-001（請修改）</w:t>
             </w:r>
           </w:p>
@@ -61,21 +79,35 @@
       <w:tr>
         <w:tc>
           <w:tcPr>
-            <w:tcW w:type="dxa" w:w="4703"/>
+            <w:tcW w:type="dxa" w:w="4986"/>
             <w:shd w:fill="E7E6E6"/>
           </w:tcPr>
           <w:p>
+            <w:pPr>
+              <w:spacing w:before="0" w:after="0" w:lineRule="auto" w:line="252"/>
+            </w:pPr>
             <w:r>
+              <w:rPr>
+                <w:rFonts w:ascii="PMingLiU" w:hAnsi="PMingLiU" w:eastAsia="PMingLiU"/>
+                <w:sz w:val="17"/>
+              </w:rPr>
               <w:t>Date 日期</w:t>
             </w:r>
           </w:p>
         </w:tc>
         <w:tc>
           <w:tcPr>
-            <w:tcW w:type="dxa" w:w="4703"/>
+            <w:tcW w:type="dxa" w:w="4986"/>
           </w:tcPr>
           <w:p>
+            <w:pPr>
+              <w:spacing w:before="0" w:after="0" w:lineRule="auto" w:line="252"/>
+            </w:pPr>
             <w:r>
+              <w:rPr>
+                <w:rFonts w:ascii="PMingLiU" w:hAnsi="PMingLiU" w:eastAsia="PMingLiU"/>
+                <w:sz w:val="17"/>
+              </w:rPr>
               <w:t>2026年5月26日（26 May 2026）</w:t>
             </w:r>
           </w:p>
@@ -84,21 +116,35 @@
       <w:tr>
         <w:tc>
           <w:tcPr>
-            <w:tcW w:type="dxa" w:w="4703"/>
+            <w:tcW w:type="dxa" w:w="4986"/>
             <w:shd w:fill="E7E6E6"/>
           </w:tcPr>
           <w:p>
+            <w:pPr>
+              <w:spacing w:before="0" w:after="0" w:lineRule="auto" w:line="252"/>
+            </w:pPr>
             <w:r>
+              <w:rPr>
+                <w:rFonts w:ascii="PMingLiU" w:hAnsi="PMingLiU" w:eastAsia="PMingLiU"/>
+                <w:sz w:val="17"/>
+              </w:rPr>
               <w:t>To 致</w:t>
             </w:r>
           </w:p>
         </w:tc>
         <w:tc>
           <w:tcPr>
-            <w:tcW w:type="dxa" w:w="4703"/>
+            <w:tcW w:type="dxa" w:w="4986"/>
           </w:tcPr>
           <w:p>
+            <w:pPr>
+              <w:spacing w:before="0" w:after="0" w:lineRule="auto" w:line="252"/>
+            </w:pPr>
             <w:r>
+              <w:rPr>
+                <w:rFonts w:ascii="PMingLiU" w:hAnsi="PMingLiU" w:eastAsia="PMingLiU"/>
+                <w:sz w:val="17"/>
+              </w:rPr>
               <w:t>（客戶公司中英文全名）</w:t>
             </w:r>
           </w:p>
@@ -107,21 +153,35 @@
       <w:tr>
         <w:tc>
           <w:tcPr>
-            <w:tcW w:type="dxa" w:w="4703"/>
+            <w:tcW w:type="dxa" w:w="4986"/>
             <w:shd w:fill="E7E6E6"/>
           </w:tcPr>
           <w:p>
+            <w:pPr>
+              <w:spacing w:before="0" w:after="0" w:lineRule="auto" w:line="252"/>
+            </w:pPr>
             <w:r>
+              <w:rPr>
+                <w:rFonts w:ascii="PMingLiU" w:hAnsi="PMingLiU" w:eastAsia="PMingLiU"/>
+                <w:sz w:val="17"/>
+              </w:rPr>
               <w:t>Attn. 聯絡人</w:t>
             </w:r>
           </w:p>
         </w:tc>
         <w:tc>
           <w:tcPr>
-            <w:tcW w:type="dxa" w:w="4703"/>
+            <w:tcW w:type="dxa" w:w="4986"/>
           </w:tcPr>
           <w:p>
+            <w:pPr>
+              <w:spacing w:before="0" w:after="0" w:lineRule="auto" w:line="252"/>
+            </w:pPr>
             <w:r>
+              <w:rPr>
+                <w:rFonts w:ascii="PMingLiU" w:hAnsi="PMingLiU" w:eastAsia="PMingLiU"/>
+                <w:sz w:val="17"/>
+              </w:rPr>
               <w:t>（姓名及職銜）</w:t>
             </w:r>
           </w:p>
@@ -130,85 +190,147 @@
       <w:tr>
         <w:tc>
           <w:tcPr>
-            <w:tcW w:type="dxa" w:w="4703"/>
+            <w:tcW w:type="dxa" w:w="4986"/>
             <w:shd w:fill="E7E6E6"/>
           </w:tcPr>
           <w:p>
+            <w:pPr>
+              <w:spacing w:before="0" w:after="0" w:lineRule="auto" w:line="252"/>
+            </w:pPr>
             <w:r>
+              <w:rPr>
+                <w:rFonts w:ascii="PMingLiU" w:hAnsi="PMingLiU" w:eastAsia="PMingLiU"/>
+                <w:sz w:val="17"/>
+              </w:rPr>
               <w:t>Address 地址</w:t>
             </w:r>
           </w:p>
         </w:tc>
         <w:tc>
           <w:tcPr>
-            <w:tcW w:type="dxa" w:w="4703"/>
+            <w:tcW w:type="dxa" w:w="4986"/>
           </w:tcPr>
           <w:p>
+            <w:pPr>
+              <w:spacing w:before="0" w:after="0" w:lineRule="auto" w:line="252"/>
+            </w:pPr>
             <w:r>
+              <w:rPr>
+                <w:rFonts w:ascii="PMingLiU" w:hAnsi="PMingLiU" w:eastAsia="PMingLiU"/>
+                <w:sz w:val="17"/>
+              </w:rPr>
               <w:t>（客戶註冊或通訊地址）</w:t>
             </w:r>
           </w:p>
         </w:tc>
       </w:tr>
     </w:tbl>
-    <w:p/>
     <w:p>
+      <w:pPr>
+        <w:spacing w:before="0" w:after="40" w:lineRule="auto" w:line="259"/>
+      </w:pPr>
       <w:r>
         <w:rPr>
+          <w:rFonts w:ascii="PMingLiU" w:hAnsi="PMingLiU" w:eastAsia="PMingLiU"/>
           <w:b/>
+          <w:i w:val="0"/>
+          <w:sz w:val="20"/>
         </w:rPr>
         <w:t>Re: 主旨</w:t>
       </w:r>
     </w:p>
     <w:p>
+      <w:pPr>
+        <w:spacing w:before="0" w:after="40" w:lineRule="auto" w:line="259"/>
+      </w:pPr>
       <w:r>
+        <w:rPr>
+          <w:rFonts w:ascii="PMingLiU" w:hAnsi="PMingLiU" w:eastAsia="PMingLiU"/>
+          <w:b w:val="0"/>
+          <w:i w:val="0"/>
+          <w:sz w:val="19"/>
+        </w:rPr>
         <w:t>Account Reconciliation as at [日期]　截至[日期]之帳目核對</w:t>
       </w:r>
     </w:p>
-    <w:p/>
     <w:p>
+      <w:pPr>
+        <w:spacing w:before="0" w:after="40" w:lineRule="auto" w:line="259"/>
+      </w:pPr>
       <w:r>
         <w:rPr>
+          <w:rFonts w:ascii="PMingLiU" w:hAnsi="PMingLiU" w:eastAsia="PMingLiU"/>
           <w:b/>
+          <w:i w:val="0"/>
+          <w:sz w:val="20"/>
         </w:rPr>
         <w:t>Dear Sirs / Madam　敬啟者：</w:t>
       </w:r>
     </w:p>
     <w:p>
+      <w:pPr>
+        <w:spacing w:before="0" w:after="40" w:lineRule="auto" w:line="259"/>
+      </w:pPr>
       <w:r>
-        <w:t>本公司為核對雙方帳目及確保記錄一致，謹將截至 ____年____月____日 止貴我雙方往來帳項之結餘列示如下，敬請查核。如與貴司帳冊記錄相符，請於下方「客戶確認」欄簽署及蓋上公司印章（或授權簽章）後，於 ____年____月____日或之前 傳真／電郵／郵寄回本司，以便存檔。</w:t>
+        <w:rPr>
+          <w:rFonts w:ascii="PMingLiU" w:hAnsi="PMingLiU" w:eastAsia="PMingLiU"/>
+          <w:b w:val="0"/>
+          <w:i w:val="0"/>
+          <w:sz w:val="19"/>
+        </w:rPr>
+        <w:t>本公司為核對雙方帳目及確保記錄一致，謹將截至 ____年____月____日 止貴我雙方往來帳項之結餘列示如下，敬請查核。如與貴司帳冊記錄相符，請於下方「客戶確認」欄簽署及蓋上公司印章（或授權簽章）後，於 ____年____月____日或之前傳真／電郵／郵寄回本司，以便存檔。</w:t>
       </w:r>
     </w:p>
     <w:p>
+      <w:pPr>
+        <w:spacing w:before="0" w:after="40" w:lineRule="auto" w:line="259"/>
+      </w:pPr>
       <w:r>
         <w:rPr>
           <w:rFonts w:ascii="Times New Roman" w:hAnsi="Times New Roman"/>
           <w:i/>
-          <w:sz w:val="20"/>
+          <w:sz w:val="18"/>
         </w:rPr>
         <w:t>For the purpose of reconciling our records, please find below the balance of our account with you as at [date]. Kindly verify the figures against your books. If the balance agrees with your records, please sign and chop the confirmation section below and return the same to us by fax / email / post on or before [date].</w:t>
       </w:r>
     </w:p>
     <w:p>
+      <w:pPr>
+        <w:spacing w:before="0" w:after="40" w:lineRule="auto" w:line="259"/>
+      </w:pPr>
       <w:r>
+        <w:rPr>
+          <w:rFonts w:ascii="PMingLiU" w:hAnsi="PMingLiU" w:eastAsia="PMingLiU"/>
+          <w:b w:val="0"/>
+          <w:i w:val="0"/>
+          <w:sz w:val="19"/>
+        </w:rPr>
         <w:t>若有不符或須調整事項，請於上述期限前以書面列明差異及依據（例如發票／收據／付款憑證編號），以便雙方盡快處理。</w:t>
       </w:r>
     </w:p>
     <w:p>
+      <w:pPr>
+        <w:spacing w:before="0" w:after="40" w:lineRule="auto" w:line="259"/>
+      </w:pPr>
       <w:r>
         <w:rPr>
           <w:rFonts w:ascii="Times New Roman" w:hAnsi="Times New Roman"/>
           <w:i/>
-          <w:sz w:val="20"/>
+          <w:sz w:val="18"/>
         </w:rPr>
         <w:t>Should there be any discrepancy, please notify us in writing before the aforesaid date, stating the nature of the difference and supporting particulars (e.g. invoice / receipt / payment reference).</w:t>
       </w:r>
     </w:p>
-    <w:p/>
     <w:p>
+      <w:pPr>
+        <w:spacing w:before="0" w:after="40" w:lineRule="auto" w:line="259"/>
+      </w:pPr>
       <w:r>
         <w:rPr>
+          <w:rFonts w:ascii="PMingLiU" w:hAnsi="PMingLiU" w:eastAsia="PMingLiU"/>
           <w:b/>
+          <w:i w:val="0"/>
+          <w:sz w:val="20"/>
         </w:rPr>
         <w:t>帳目結餘摘要　Account Summary</w:t>
       </w:r>
@@ -219,28 +341,42 @@
         <w:tblLook w:firstColumn="1" w:firstRow="1" w:lastColumn="0" w:lastRow="0" w:noHBand="0" w:noVBand="1" w:val="04A0"/>
       </w:tblPr>
       <w:tblGrid>
-        <w:gridCol w:w="4703"/>
-        <w:gridCol w:w="4703"/>
+        <w:gridCol w:w="4986"/>
+        <w:gridCol w:w="4986"/>
       </w:tblGrid>
       <w:tr>
         <w:tc>
           <w:tcPr>
-            <w:tcW w:type="dxa" w:w="4703"/>
+            <w:tcW w:type="dxa" w:w="4986"/>
             <w:shd w:fill="D9D9D9"/>
           </w:tcPr>
           <w:p>
+            <w:pPr>
+              <w:spacing w:before="0" w:after="0" w:lineRule="auto" w:line="252"/>
+            </w:pPr>
             <w:r>
+              <w:rPr>
+                <w:rFonts w:ascii="PMingLiU" w:hAnsi="PMingLiU" w:eastAsia="PMingLiU"/>
+                <w:sz w:val="17"/>
+              </w:rPr>
               <w:t>說明 Description</w:t>
             </w:r>
           </w:p>
         </w:tc>
         <w:tc>
           <w:tcPr>
-            <w:tcW w:type="dxa" w:w="4703"/>
+            <w:tcW w:type="dxa" w:w="4986"/>
             <w:shd w:fill="D9D9D9"/>
           </w:tcPr>
           <w:p>
+            <w:pPr>
+              <w:spacing w:before="0" w:after="0" w:lineRule="auto" w:line="252"/>
+            </w:pPr>
             <w:r>
+              <w:rPr>
+                <w:rFonts w:ascii="PMingLiU" w:hAnsi="PMingLiU" w:eastAsia="PMingLiU"/>
+                <w:sz w:val="17"/>
+              </w:rPr>
               <w:t>金額（港幣 HKD）Amount (HKD)</w:t>
             </w:r>
           </w:p>
@@ -249,22 +385,34 @@
       <w:tr>
         <w:tc>
           <w:tcPr>
-            <w:tcW w:type="dxa" w:w="4703"/>
+            <w:tcW w:type="dxa" w:w="4986"/>
           </w:tcPr>
           <w:p>
+            <w:pPr>
+              <w:spacing w:before="0" w:after="0" w:lineRule="auto" w:line="252"/>
+            </w:pPr>
             <w:r>
-              <w:t>截至上述日期之應收／應付結餘（請刪去不適用者）</w:t>
-              <w:br/>
-              <w:t>Balance as at [date] (AR / AP — delete as applicable)</w:t>
+              <w:rPr>
+                <w:rFonts w:ascii="PMingLiU" w:hAnsi="PMingLiU" w:eastAsia="PMingLiU"/>
+                <w:sz w:val="17"/>
+              </w:rPr>
+              <w:t>截至上述日期之應收／應付結餘（刪去不適用）Balance as at [date] (AR / AP)</w:t>
             </w:r>
           </w:p>
         </w:tc>
         <w:tc>
           <w:tcPr>
-            <w:tcW w:type="dxa" w:w="4703"/>
+            <w:tcW w:type="dxa" w:w="4986"/>
           </w:tcPr>
           <w:p>
+            <w:pPr>
+              <w:spacing w:before="0" w:after="0" w:lineRule="auto" w:line="252"/>
+            </w:pPr>
             <w:r>
+              <w:rPr>
+                <w:rFonts w:ascii="PMingLiU" w:hAnsi="PMingLiU" w:eastAsia="PMingLiU"/>
+                <w:sz w:val="17"/>
+              </w:rPr>
               <w:t>$ ________________</w:t>
             </w:r>
           </w:p>
@@ -273,33 +421,50 @@
       <w:tr>
         <w:tc>
           <w:tcPr>
-            <w:tcW w:type="dxa" w:w="4703"/>
+            <w:tcW w:type="dxa" w:w="4986"/>
           </w:tcPr>
           <w:p>
+            <w:pPr>
+              <w:spacing w:before="0" w:after="0" w:lineRule="auto" w:line="252"/>
+            </w:pPr>
             <w:r>
-              <w:t>其中：已開立但未到期款項（如適用）</w:t>
-              <w:br/>
-              <w:t>Including: amounts not yet due (if any)</w:t>
+              <w:rPr>
+                <w:rFonts w:ascii="PMingLiU" w:hAnsi="PMingLiU" w:eastAsia="PMingLiU"/>
+                <w:sz w:val="17"/>
+              </w:rPr>
+              <w:t>其中：已開立但未到期款項（如適用）Including amounts not yet due (if any)</w:t>
             </w:r>
           </w:p>
         </w:tc>
         <w:tc>
           <w:tcPr>
-            <w:tcW w:type="dxa" w:w="4703"/>
+            <w:tcW w:type="dxa" w:w="4986"/>
           </w:tcPr>
           <w:p>
+            <w:pPr>
+              <w:spacing w:before="0" w:after="0" w:lineRule="auto" w:line="252"/>
+            </w:pPr>
             <w:r>
+              <w:rPr>
+                <w:rFonts w:ascii="PMingLiU" w:hAnsi="PMingLiU" w:eastAsia="PMingLiU"/>
+                <w:sz w:val="17"/>
+              </w:rPr>
               <w:t>$ ________________</w:t>
             </w:r>
           </w:p>
         </w:tc>
       </w:tr>
     </w:tbl>
-    <w:p/>
     <w:p>
+      <w:pPr>
+        <w:spacing w:before="0" w:after="40" w:lineRule="auto" w:line="259"/>
+      </w:pPr>
       <w:r>
         <w:rPr>
+          <w:rFonts w:ascii="PMingLiU" w:hAnsi="PMingLiU" w:eastAsia="PMingLiU"/>
           <w:b/>
+          <w:i w:val="0"/>
+          <w:sz w:val="20"/>
         </w:rPr>
         <w:t>明細附表（可另附附件）　Detailed listing — may attach schedule</w:t>
       </w:r>
@@ -310,103 +475,138 @@
         <w:tblLook w:firstColumn="1" w:firstRow="1" w:lastColumn="0" w:lastRow="0" w:noHBand="0" w:noVBand="1" w:val="04A0"/>
       </w:tblPr>
       <w:tblGrid>
-        <w:gridCol w:w="1344"/>
-        <w:gridCol w:w="1344"/>
-        <w:gridCol w:w="1344"/>
-        <w:gridCol w:w="1344"/>
-        <w:gridCol w:w="1344"/>
-        <w:gridCol w:w="1344"/>
-        <w:gridCol w:w="1344"/>
+        <w:gridCol w:w="1425"/>
+        <w:gridCol w:w="1425"/>
+        <w:gridCol w:w="1425"/>
+        <w:gridCol w:w="1425"/>
+        <w:gridCol w:w="1425"/>
+        <w:gridCol w:w="1425"/>
+        <w:gridCol w:w="1425"/>
       </w:tblGrid>
       <w:tr>
         <w:tc>
           <w:tcPr>
-            <w:tcW w:type="dxa" w:w="1344"/>
+            <w:tcW w:type="dxa" w:w="1425"/>
             <w:shd w:fill="D9D9D9"/>
           </w:tcPr>
           <w:p>
+            <w:pPr>
+              <w:spacing w:before="0" w:after="0" w:lineRule="auto" w:line="252"/>
+            </w:pPr>
             <w:r>
-              <w:t>日期</w:t>
-              <w:br/>
-              <w:t>Date</w:t>
+              <w:rPr>
+                <w:rFonts w:ascii="PMingLiU" w:hAnsi="PMingLiU" w:eastAsia="PMingLiU"/>
+                <w:sz w:val="17"/>
+              </w:rPr>
+              <w:t>日期 Date</w:t>
             </w:r>
           </w:p>
         </w:tc>
         <w:tc>
           <w:tcPr>
-            <w:tcW w:type="dxa" w:w="1344"/>
+            <w:tcW w:type="dxa" w:w="1425"/>
             <w:shd w:fill="D9D9D9"/>
           </w:tcPr>
           <w:p>
+            <w:pPr>
+              <w:spacing w:before="0" w:after="0" w:lineRule="auto" w:line="252"/>
+            </w:pPr>
             <w:r>
-              <w:t>單據類別</w:t>
-              <w:br/>
-              <w:t>Type</w:t>
+              <w:rPr>
+                <w:rFonts w:ascii="PMingLiU" w:hAnsi="PMingLiU" w:eastAsia="PMingLiU"/>
+                <w:sz w:val="17"/>
+              </w:rPr>
+              <w:t>類別 Type</w:t>
             </w:r>
           </w:p>
         </w:tc>
         <w:tc>
           <w:tcPr>
-            <w:tcW w:type="dxa" w:w="1344"/>
+            <w:tcW w:type="dxa" w:w="1425"/>
             <w:shd w:fill="D9D9D9"/>
           </w:tcPr>
           <w:p>
+            <w:pPr>
+              <w:spacing w:before="0" w:after="0" w:lineRule="auto" w:line="252"/>
+            </w:pPr>
             <w:r>
-              <w:t>單據編號</w:t>
-              <w:br/>
-              <w:t>Ref.</w:t>
+              <w:rPr>
+                <w:rFonts w:ascii="PMingLiU" w:hAnsi="PMingLiU" w:eastAsia="PMingLiU"/>
+                <w:sz w:val="17"/>
+              </w:rPr>
+              <w:t>編號 Ref.</w:t>
             </w:r>
           </w:p>
         </w:tc>
         <w:tc>
           <w:tcPr>
-            <w:tcW w:type="dxa" w:w="1344"/>
+            <w:tcW w:type="dxa" w:w="1425"/>
             <w:shd w:fill="D9D9D9"/>
           </w:tcPr>
           <w:p>
+            <w:pPr>
+              <w:spacing w:before="0" w:after="0" w:lineRule="auto" w:line="252"/>
+            </w:pPr>
             <w:r>
-              <w:t>摘要</w:t>
-              <w:br/>
-              <w:t>Particulars</w:t>
+              <w:rPr>
+                <w:rFonts w:ascii="PMingLiU" w:hAnsi="PMingLiU" w:eastAsia="PMingLiU"/>
+                <w:sz w:val="17"/>
+              </w:rPr>
+              <w:t>摘要 Particulars</w:t>
             </w:r>
           </w:p>
         </w:tc>
         <w:tc>
           <w:tcPr>
-            <w:tcW w:type="dxa" w:w="1344"/>
+            <w:tcW w:type="dxa" w:w="1425"/>
             <w:shd w:fill="D9D9D9"/>
           </w:tcPr>
           <w:p>
+            <w:pPr>
+              <w:spacing w:before="0" w:after="0" w:lineRule="auto" w:line="252"/>
+            </w:pPr>
             <w:r>
-              <w:t>借方</w:t>
-              <w:br/>
-              <w:t>Debit</w:t>
+              <w:rPr>
+                <w:rFonts w:ascii="PMingLiU" w:hAnsi="PMingLiU" w:eastAsia="PMingLiU"/>
+                <w:sz w:val="17"/>
+              </w:rPr>
+              <w:t>借方 Dr</w:t>
             </w:r>
           </w:p>
         </w:tc>
         <w:tc>
           <w:tcPr>
-            <w:tcW w:type="dxa" w:w="1344"/>
+            <w:tcW w:type="dxa" w:w="1425"/>
             <w:shd w:fill="D9D9D9"/>
           </w:tcPr>
           <w:p>
+            <w:pPr>
+              <w:spacing w:before="0" w:after="0" w:lineRule="auto" w:line="252"/>
+            </w:pPr>
             <w:r>
-              <w:t>貸方</w:t>
-              <w:br/>
-              <w:t>Credit</w:t>
+              <w:rPr>
+                <w:rFonts w:ascii="PMingLiU" w:hAnsi="PMingLiU" w:eastAsia="PMingLiU"/>
+                <w:sz w:val="17"/>
+              </w:rPr>
+              <w:t>貸方 Cr</w:t>
             </w:r>
           </w:p>
         </w:tc>
         <w:tc>
           <w:tcPr>
-            <w:tcW w:type="dxa" w:w="1344"/>
+            <w:tcW w:type="dxa" w:w="1425"/>
             <w:shd w:fill="D9D9D9"/>
           </w:tcPr>
           <w:p>
+            <w:pPr>
+              <w:spacing w:before="0" w:after="0" w:lineRule="auto" w:line="252"/>
+            </w:pPr>
             <w:r>
-              <w:t>結餘</w:t>
-              <w:br/>
-              <w:t>Balance</w:t>
+              <w:rPr>
+                <w:rFonts w:ascii="PMingLiU" w:hAnsi="PMingLiU" w:eastAsia="PMingLiU"/>
+                <w:sz w:val="17"/>
+              </w:rPr>
+              <w:t>結餘 Bal.</w:t>
             </w:r>
           </w:p>
         </w:tc>
@@ -414,138 +614,150 @@
       <w:tr>
         <w:tc>
           <w:tcPr>
-            <w:tcW w:type="dxa" w:w="1344"/>
+            <w:tcW w:type="dxa" w:w="1425"/>
           </w:tcPr>
           <w:p>
-            <w:r/>
+            <w:pPr>
+              <w:spacing w:before="0" w:after="0" w:lineRule="auto" w:line="252"/>
+            </w:pPr>
+            <w:r>
+              <w:rPr>
+                <w:rFonts w:ascii="PMingLiU" w:hAnsi="PMingLiU" w:eastAsia="PMingLiU"/>
+                <w:sz w:val="17"/>
+              </w:rPr>
+            </w:r>
           </w:p>
         </w:tc>
         <w:tc>
           <w:tcPr>
-            <w:tcW w:type="dxa" w:w="1344"/>
+            <w:tcW w:type="dxa" w:w="1425"/>
           </w:tcPr>
           <w:p>
-            <w:r/>
+            <w:pPr>
+              <w:spacing w:before="0" w:after="0" w:lineRule="auto" w:line="252"/>
+            </w:pPr>
+            <w:r>
+              <w:rPr>
+                <w:rFonts w:ascii="PMingLiU" w:hAnsi="PMingLiU" w:eastAsia="PMingLiU"/>
+                <w:sz w:val="17"/>
+              </w:rPr>
+            </w:r>
           </w:p>
         </w:tc>
         <w:tc>
           <w:tcPr>
-            <w:tcW w:type="dxa" w:w="1344"/>
+            <w:tcW w:type="dxa" w:w="1425"/>
           </w:tcPr>
           <w:p>
-            <w:r/>
+            <w:pPr>
+              <w:spacing w:before="0" w:after="0" w:lineRule="auto" w:line="252"/>
+            </w:pPr>
+            <w:r>
+              <w:rPr>
+                <w:rFonts w:ascii="PMingLiU" w:hAnsi="PMingLiU" w:eastAsia="PMingLiU"/>
+                <w:sz w:val="17"/>
+              </w:rPr>
+            </w:r>
           </w:p>
         </w:tc>
         <w:tc>
           <w:tcPr>
-            <w:tcW w:type="dxa" w:w="1344"/>
+            <w:tcW w:type="dxa" w:w="1425"/>
           </w:tcPr>
           <w:p>
-            <w:r/>
+            <w:pPr>
+              <w:spacing w:before="0" w:after="0" w:lineRule="auto" w:line="252"/>
+            </w:pPr>
+            <w:r>
+              <w:rPr>
+                <w:rFonts w:ascii="PMingLiU" w:hAnsi="PMingLiU" w:eastAsia="PMingLiU"/>
+                <w:sz w:val="17"/>
+              </w:rPr>
+            </w:r>
           </w:p>
         </w:tc>
         <w:tc>
           <w:tcPr>
-            <w:tcW w:type="dxa" w:w="1344"/>
+            <w:tcW w:type="dxa" w:w="1425"/>
           </w:tcPr>
           <w:p>
-            <w:r/>
+            <w:pPr>
+              <w:spacing w:before="0" w:after="0" w:lineRule="auto" w:line="252"/>
+            </w:pPr>
+            <w:r>
+              <w:rPr>
+                <w:rFonts w:ascii="PMingLiU" w:hAnsi="PMingLiU" w:eastAsia="PMingLiU"/>
+                <w:sz w:val="17"/>
+              </w:rPr>
+            </w:r>
           </w:p>
         </w:tc>
         <w:tc>
           <w:tcPr>
-            <w:tcW w:type="dxa" w:w="1344"/>
+            <w:tcW w:type="dxa" w:w="1425"/>
           </w:tcPr>
           <w:p>
-            <w:r/>
+            <w:pPr>
+              <w:spacing w:before="0" w:after="0" w:lineRule="auto" w:line="252"/>
+            </w:pPr>
+            <w:r>
+              <w:rPr>
+                <w:rFonts w:ascii="PMingLiU" w:hAnsi="PMingLiU" w:eastAsia="PMingLiU"/>
+                <w:sz w:val="17"/>
+              </w:rPr>
+            </w:r>
           </w:p>
         </w:tc>
         <w:tc>
           <w:tcPr>
-            <w:tcW w:type="dxa" w:w="1344"/>
+            <w:tcW w:type="dxa" w:w="1425"/>
           </w:tcPr>
           <w:p>
-            <w:r/>
+            <w:pPr>
+              <w:spacing w:before="0" w:after="0" w:lineRule="auto" w:line="252"/>
+            </w:pPr>
+            <w:r>
+              <w:rPr>
+                <w:rFonts w:ascii="PMingLiU" w:hAnsi="PMingLiU" w:eastAsia="PMingLiU"/>
+                <w:sz w:val="17"/>
+              </w:rPr>
+            </w:r>
           </w:p>
         </w:tc>
       </w:tr>
       <w:tr>
         <w:tc>
           <w:tcPr>
-            <w:tcW w:type="dxa" w:w="1344"/>
-          </w:tcPr>
-          <w:p>
-            <w:r/>
-          </w:p>
-        </w:tc>
-        <w:tc>
-          <w:tcPr>
-            <w:tcW w:type="dxa" w:w="1344"/>
-          </w:tcPr>
-          <w:p>
-            <w:r/>
-          </w:p>
-        </w:tc>
-        <w:tc>
-          <w:tcPr>
-            <w:tcW w:type="dxa" w:w="1344"/>
-          </w:tcPr>
-          <w:p>
-            <w:r/>
-          </w:p>
-        </w:tc>
-        <w:tc>
-          <w:tcPr>
-            <w:tcW w:type="dxa" w:w="1344"/>
-          </w:tcPr>
-          <w:p>
-            <w:r/>
-          </w:p>
-        </w:tc>
-        <w:tc>
-          <w:tcPr>
-            <w:tcW w:type="dxa" w:w="1344"/>
-          </w:tcPr>
-          <w:p>
-            <w:r/>
-          </w:p>
-        </w:tc>
-        <w:tc>
-          <w:tcPr>
-            <w:tcW w:type="dxa" w:w="1344"/>
-          </w:tcPr>
-          <w:p>
-            <w:r/>
-          </w:p>
-        </w:tc>
-        <w:tc>
-          <w:tcPr>
-            <w:tcW w:type="dxa" w:w="1344"/>
-          </w:tcPr>
-          <w:p>
-            <w:r/>
-          </w:p>
-        </w:tc>
-      </w:tr>
-      <w:tr>
-        <w:tc>
-          <w:tcPr>
-            <w:tcW w:type="dxa" w:w="8064"/>
+            <w:tcW w:type="dxa" w:w="8550"/>
             <w:gridSpan w:val="6"/>
             <w:shd w:fill="F2F2F2"/>
           </w:tcPr>
           <w:p>
+            <w:pPr>
+              <w:spacing w:before="0" w:after="0" w:lineRule="auto" w:line="252"/>
+            </w:pPr>
             <w:r>
+              <w:rPr>
+                <w:rFonts w:ascii="PMingLiU" w:hAnsi="PMingLiU" w:eastAsia="PMingLiU"/>
+                <w:sz w:val="17"/>
+              </w:rPr>
               <w:t>結餘 Total</w:t>
             </w:r>
           </w:p>
         </w:tc>
         <w:tc>
           <w:tcPr>
-            <w:tcW w:type="dxa" w:w="1344"/>
+            <w:tcW w:type="dxa" w:w="1425"/>
           </w:tcPr>
           <w:p>
+            <w:pPr>
+              <w:spacing w:before="0" w:after="0" w:lineRule="auto" w:line="252"/>
+            </w:pPr>
             <w:r>
+              <w:rPr>
+                <w:rFonts w:ascii="PMingLiU" w:hAnsi="PMingLiU" w:eastAsia="PMingLiU"/>
+                <w:sz w:val="17"/>
+              </w:rPr>
               <w:t>$ ________________</w:t>
             </w:r>
           </w:p>
@@ -553,44 +765,70 @@
       </w:tr>
     </w:tbl>
     <w:p>
+      <w:pPr>
+        <w:spacing w:before="0" w:after="40" w:lineRule="auto" w:line="259"/>
+      </w:pPr>
       <w:r>
         <w:rPr>
-          <w:sz w:val="18"/>
+          <w:rFonts w:ascii="PMingLiU" w:hAnsi="PMingLiU" w:eastAsia="PMingLiU"/>
+          <w:b w:val="0"/>
+          <w:i w:val="0"/>
+          <w:sz w:val="16"/>
         </w:rPr>
-        <w:t>註：香港習慣以港幣列示；若合約約定其他貨幣，請改列並註明幣別。</w:t>
-      </w:r>
-    </w:p>
-    <w:p/>
-    <w:p>
-      <w:r>
-        <w:rPr>
-          <w:b/>
-        </w:rPr>
-        <w:t>（可選）法律／合約提示　Optional clauses</w:t>
+        <w:t>註：預設港幣 HKD；若合約約定其他貨幣請改列並註明。</w:t>
       </w:r>
     </w:p>
     <w:p>
+      <w:pPr>
+        <w:spacing w:before="0" w:after="40" w:lineRule="auto" w:line="259"/>
+      </w:pPr>
       <w:r>
-        <w:t>1. 無爭議款項：若貴司未於上述期限內提出書面異議，則視為確認上述結餘；惟此舉是否影響任何一方在合約或法例下的權利，請按公司政策及律師意見調整後再採用。</w:t>
-        <w:br/>
-        <w:t>2. 個人資料：本函所載聯絡資料僅作對帳用途，並按香港《個人資料（私隱）條例》處理。</w:t>
+        <w:rPr>
+          <w:rFonts w:ascii="PMingLiU" w:hAnsi="PMingLiU" w:eastAsia="PMingLiU"/>
+          <w:b/>
+          <w:i w:val="0"/>
+          <w:sz w:val="19"/>
+        </w:rPr>
+        <w:t>（可選）法律／私隱提示　Optional</w:t>
       </w:r>
     </w:p>
     <w:p>
+      <w:pPr>
+        <w:spacing w:before="0" w:after="40" w:lineRule="auto" w:line="259"/>
+      </w:pPr>
+      <w:r>
+        <w:rPr>
+          <w:rFonts w:ascii="PMingLiU" w:hAnsi="PMingLiU" w:eastAsia="PMingLiU"/>
+          <w:b w:val="0"/>
+          <w:i w:val="0"/>
+          <w:sz w:val="17"/>
+        </w:rPr>
+        <w:t>1）「視為確認」類條款可能具法律效果，採用前請內部法務／律師審閱。2）聯絡資料僅作對帳用途，並按香港《個人資料（私隱）條例》處理。</w:t>
+      </w:r>
+    </w:p>
+    <w:p>
+      <w:pPr>
+        <w:spacing w:before="0" w:after="40" w:lineRule="auto" w:line="259"/>
+      </w:pPr>
       <w:r>
         <w:rPr>
           <w:rFonts w:ascii="Times New Roman" w:hAnsi="Times New Roman"/>
           <w:i/>
-          <w:sz w:val="18"/>
+          <w:sz w:val="16"/>
         </w:rPr>
-        <w:t>Note: Any “deemed acceptance” wording may have legal effect — obtain legal review before use.</w:t>
+        <w:t>Note: “Deemed acceptance” wording — obtain legal review before use.</w:t>
       </w:r>
     </w:p>
-    <w:p/>
     <w:p>
+      <w:pPr>
+        <w:spacing w:before="0" w:after="40" w:lineRule="auto" w:line="259"/>
+      </w:pPr>
       <w:r>
         <w:rPr>
+          <w:rFonts w:ascii="PMingLiU" w:hAnsi="PMingLiU" w:eastAsia="PMingLiU"/>
           <w:b/>
+          <w:i w:val="0"/>
+          <w:sz w:val="20"/>
         </w:rPr>
         <w:t>發函公司資料　Our Company Particulars</w:t>
       </w:r>
@@ -601,69 +839,113 @@
         <w:tblLook w:firstColumn="1" w:firstRow="1" w:lastColumn="0" w:lastRow="0" w:noHBand="0" w:noVBand="1" w:val="04A0"/>
       </w:tblPr>
       <w:tblGrid>
-        <w:gridCol w:w="4703"/>
-        <w:gridCol w:w="4703"/>
+        <w:gridCol w:w="4986"/>
+        <w:gridCol w:w="4986"/>
       </w:tblGrid>
       <w:tr>
         <w:tc>
           <w:tcPr>
-            <w:tcW w:type="dxa" w:w="4703"/>
+            <w:tcW w:type="dxa" w:w="4986"/>
             <w:shd w:fill="E7E6E6"/>
           </w:tcPr>
           <w:p>
+            <w:pPr>
+              <w:spacing w:before="0" w:after="0" w:lineRule="auto" w:line="252"/>
+            </w:pPr>
             <w:r>
+              <w:rPr>
+                <w:rFonts w:ascii="PMingLiU" w:hAnsi="PMingLiU" w:eastAsia="PMingLiU"/>
+                <w:sz w:val="17"/>
+              </w:rPr>
               <w:t>公司中文名稱</w:t>
             </w:r>
           </w:p>
         </w:tc>
         <w:tc>
           <w:tcPr>
-            <w:tcW w:type="dxa" w:w="4703"/>
+            <w:tcW w:type="dxa" w:w="4986"/>
           </w:tcPr>
           <w:p>
-            <w:r/>
+            <w:pPr>
+              <w:spacing w:before="0" w:after="0" w:lineRule="auto" w:line="252"/>
+            </w:pPr>
+            <w:r>
+              <w:rPr>
+                <w:rFonts w:ascii="PMingLiU" w:hAnsi="PMingLiU" w:eastAsia="PMingLiU"/>
+                <w:sz w:val="17"/>
+              </w:rPr>
+            </w:r>
           </w:p>
         </w:tc>
       </w:tr>
       <w:tr>
         <w:tc>
           <w:tcPr>
-            <w:tcW w:type="dxa" w:w="4703"/>
+            <w:tcW w:type="dxa" w:w="4986"/>
             <w:shd w:fill="E7E6E6"/>
           </w:tcPr>
           <w:p>
+            <w:pPr>
+              <w:spacing w:before="0" w:after="0" w:lineRule="auto" w:line="252"/>
+            </w:pPr>
             <w:r>
+              <w:rPr>
+                <w:rFonts w:ascii="PMingLiU" w:hAnsi="PMingLiU" w:eastAsia="PMingLiU"/>
+                <w:sz w:val="17"/>
+              </w:rPr>
               <w:t>英文名稱 English name</w:t>
             </w:r>
           </w:p>
         </w:tc>
         <w:tc>
           <w:tcPr>
-            <w:tcW w:type="dxa" w:w="4703"/>
+            <w:tcW w:type="dxa" w:w="4986"/>
           </w:tcPr>
           <w:p>
-            <w:r/>
+            <w:pPr>
+              <w:spacing w:before="0" w:after="0" w:lineRule="auto" w:line="252"/>
+            </w:pPr>
+            <w:r>
+              <w:rPr>
+                <w:rFonts w:ascii="PMingLiU" w:hAnsi="PMingLiU" w:eastAsia="PMingLiU"/>
+                <w:sz w:val="17"/>
+              </w:rPr>
+            </w:r>
           </w:p>
         </w:tc>
       </w:tr>
       <w:tr>
         <w:tc>
           <w:tcPr>
-            <w:tcW w:type="dxa" w:w="4703"/>
+            <w:tcW w:type="dxa" w:w="4986"/>
             <w:shd w:fill="E7E6E6"/>
           </w:tcPr>
           <w:p>
+            <w:pPr>
+              <w:spacing w:before="0" w:after="0" w:lineRule="auto" w:line="252"/>
+            </w:pPr>
             <w:r>
-              <w:t>註冊／營業地址 Registered / business address</w:t>
+              <w:rPr>
+                <w:rFonts w:ascii="PMingLiU" w:hAnsi="PMingLiU" w:eastAsia="PMingLiU"/>
+                <w:sz w:val="17"/>
+              </w:rPr>
+              <w:t>註冊／營業地址 Address</w:t>
             </w:r>
           </w:p>
         </w:tc>
         <w:tc>
           <w:tcPr>
-            <w:tcW w:type="dxa" w:w="4703"/>
+            <w:tcW w:type="dxa" w:w="4986"/>
           </w:tcPr>
           <w:p>
+            <w:pPr>
+              <w:spacing w:before="0" w:after="0" w:lineRule="auto" w:line="252"/>
+            </w:pPr>
             <w:r>
+              <w:rPr>
+                <w:rFonts w:ascii="PMingLiU" w:hAnsi="PMingLiU" w:eastAsia="PMingLiU"/>
+                <w:sz w:val="17"/>
+              </w:rPr>
               <w:t>（香港地址）</w:t>
             </w:r>
           </w:p>
@@ -672,22 +954,36 @@
       <w:tr>
         <w:tc>
           <w:tcPr>
-            <w:tcW w:type="dxa" w:w="4703"/>
+            <w:tcW w:type="dxa" w:w="4986"/>
             <w:shd w:fill="E7E6E6"/>
           </w:tcPr>
           <w:p>
+            <w:pPr>
+              <w:spacing w:before="0" w:after="0" w:lineRule="auto" w:line="252"/>
+            </w:pPr>
             <w:r>
-              <w:t>商業登記證號碼 BR No.</w:t>
+              <w:rPr>
+                <w:rFonts w:ascii="PMingLiU" w:hAnsi="PMingLiU" w:eastAsia="PMingLiU"/>
+                <w:sz w:val="17"/>
+              </w:rPr>
+              <w:t>BR 商業登記證號碼 / CR 公司註冊編號（如適用）</w:t>
             </w:r>
           </w:p>
         </w:tc>
         <w:tc>
           <w:tcPr>
-            <w:tcW w:type="dxa" w:w="4703"/>
+            <w:tcW w:type="dxa" w:w="4986"/>
           </w:tcPr>
           <w:p>
+            <w:pPr>
+              <w:spacing w:before="0" w:after="0" w:lineRule="auto" w:line="252"/>
+            </w:pPr>
             <w:r>
-              <w:t>（例：12345678-XXX-XX-XX-X）</w:t>
+              <w:rPr>
+                <w:rFonts w:ascii="PMingLiU" w:hAnsi="PMingLiU" w:eastAsia="PMingLiU"/>
+                <w:sz w:val="17"/>
+              </w:rPr>
+              <w:t>（例：BR …；CR …）</w:t>
             </w:r>
           </w:p>
         </w:tc>
@@ -695,94 +991,77 @@
       <w:tr>
         <w:tc>
           <w:tcPr>
-            <w:tcW w:type="dxa" w:w="4703"/>
+            <w:tcW w:type="dxa" w:w="4986"/>
             <w:shd w:fill="E7E6E6"/>
           </w:tcPr>
           <w:p>
+            <w:pPr>
+              <w:spacing w:before="0" w:after="0" w:lineRule="auto" w:line="252"/>
+            </w:pPr>
             <w:r>
-              <w:t>公司註冊編號（如適用）CR No.</w:t>
+              <w:rPr>
+                <w:rFonts w:ascii="PMingLiU" w:hAnsi="PMingLiU" w:eastAsia="PMingLiU"/>
+                <w:sz w:val="17"/>
+              </w:rPr>
+              <w:t>聯絡 Tel／Fax／Email</w:t>
             </w:r>
           </w:p>
         </w:tc>
         <w:tc>
           <w:tcPr>
-            <w:tcW w:type="dxa" w:w="4703"/>
+            <w:tcW w:type="dxa" w:w="4986"/>
           </w:tcPr>
           <w:p>
+            <w:pPr>
+              <w:spacing w:before="0" w:after="0" w:lineRule="auto" w:line="252"/>
+            </w:pPr>
             <w:r>
-              <w:t>（有限公司）</w:t>
+              <w:rPr>
+                <w:rFonts w:ascii="PMingLiU" w:hAnsi="PMingLiU" w:eastAsia="PMingLiU"/>
+                <w:sz w:val="17"/>
+              </w:rPr>
             </w:r>
           </w:p>
         </w:tc>
       </w:tr>
-      <w:tr>
-        <w:tc>
-          <w:tcPr>
-            <w:tcW w:type="dxa" w:w="4703"/>
-            <w:shd w:fill="E7E6E6"/>
-          </w:tcPr>
-          <w:p>
-            <w:r>
-              <w:t>電話／傳真 Tel / Fax</w:t>
-            </w:r>
-          </w:p>
-        </w:tc>
-        <w:tc>
-          <w:tcPr>
-            <w:tcW w:type="dxa" w:w="4703"/>
-          </w:tcPr>
-          <w:p>
-            <w:r/>
-          </w:p>
-        </w:tc>
-      </w:tr>
-      <w:tr>
-        <w:tc>
-          <w:tcPr>
-            <w:tcW w:type="dxa" w:w="4703"/>
-            <w:shd w:fill="E7E6E6"/>
-          </w:tcPr>
-          <w:p>
-            <w:r>
-              <w:t>電郵 Email</w:t>
-            </w:r>
-          </w:p>
-        </w:tc>
-        <w:tc>
-          <w:tcPr>
-            <w:tcW w:type="dxa" w:w="4703"/>
-          </w:tcPr>
-          <w:p>
-            <w:r/>
-          </w:p>
-        </w:tc>
-      </w:tr>
     </w:tbl>
-    <w:p/>
     <w:p>
-      <w:r>
-        <w:br w:type="page"/>
-      </w:r>
-    </w:p>
-    <w:p>
+      <w:pPr>
+        <w:spacing w:before="0" w:after="40" w:lineRule="auto" w:line="259"/>
+      </w:pPr>
       <w:r>
         <w:rPr>
+          <w:rFonts w:ascii="PMingLiU" w:hAnsi="PMingLiU" w:eastAsia="PMingLiU"/>
           <w:b/>
+          <w:i w:val="0"/>
+          <w:sz w:val="20"/>
         </w:rPr>
         <w:t>客戶確認（回函用）　Customer Confirmation</w:t>
       </w:r>
     </w:p>
     <w:p>
+      <w:pPr>
+        <w:spacing w:before="0" w:after="40" w:lineRule="auto" w:line="259"/>
+      </w:pPr>
       <w:r>
-        <w:t>茲確認截至 ____年____月____日，上述結餘 HKD $ ________________ 與敝公司帳冊記錄　相符 □　不符 □（如不符，請另紙說明）。</w:t>
+        <w:rPr>
+          <w:rFonts w:ascii="PMingLiU" w:hAnsi="PMingLiU" w:eastAsia="PMingLiU"/>
+          <w:b w:val="0"/>
+          <w:i w:val="0"/>
+          <w:sz w:val="19"/>
+        </w:rPr>
+        <w:t>茲確認截至 ____年____月____日，上述結餘 HKD $ ________________ 與敝公司帳冊記錄　相符 □　不符 □（不符請另紙說明）。</w:t>
       </w:r>
     </w:p>
     <w:p>
+      <w:pPr>
+        <w:spacing w:before="0" w:after="40" w:lineRule="auto" w:line="259"/>
+      </w:pPr>
       <w:r>
         <w:rPr>
           <w:rFonts w:ascii="Times New Roman" w:hAnsi="Times New Roman"/>
           <w:i/>
-          <w:sz w:val="20"/>
+          <w:sz w:val="18"/>
         </w:rPr>
         <w:t>We confirm that, as at [date], the above balance of HKD $________ agrees □ / does not agree □ with our records (if not agreed, please attach particulars).</w:t>
       </w:r>
@@ -793,95 +1072,41 @@
         <w:tblLook w:firstColumn="1" w:firstRow="1" w:lastColumn="0" w:lastRow="0" w:noHBand="0" w:noVBand="1" w:val="04A0"/>
       </w:tblPr>
       <w:tblGrid>
-        <w:gridCol w:w="4703"/>
-        <w:gridCol w:w="4703"/>
+        <w:gridCol w:w="4986"/>
+        <w:gridCol w:w="4986"/>
       </w:tblGrid>
       <w:tr>
         <w:tc>
           <w:tcPr>
-            <w:tcW w:type="dxa" w:w="4703"/>
+            <w:tcW w:type="dxa" w:w="4986"/>
             <w:shd w:fill="E7E6E6"/>
           </w:tcPr>
           <w:p>
+            <w:pPr>
+              <w:spacing w:before="0" w:after="0" w:lineRule="auto" w:line="252"/>
+            </w:pPr>
             <w:r>
+              <w:rPr>
+                <w:rFonts w:ascii="PMingLiU" w:hAnsi="PMingLiU" w:eastAsia="PMingLiU"/>
+                <w:sz w:val="17"/>
+              </w:rPr>
               <w:t>授權簽署 Authorized Signature</w:t>
             </w:r>
           </w:p>
         </w:tc>
         <w:tc>
           <w:tcPr>
-            <w:tcW w:type="dxa" w:w="4703"/>
+            <w:tcW w:type="dxa" w:w="4986"/>
           </w:tcPr>
           <w:p>
-            <w:r/>
-          </w:p>
-        </w:tc>
-      </w:tr>
-      <w:tr>
-        <w:tc>
-          <w:tcPr>
-            <w:tcW w:type="dxa" w:w="4703"/>
-            <w:shd w:fill="E7E6E6"/>
-          </w:tcPr>
-          <w:p>
+            <w:pPr>
+              <w:spacing w:before="0" w:after="0" w:lineRule="auto" w:line="252"/>
+            </w:pPr>
             <w:r>
-              <w:t>姓名 Name</w:t>
-            </w:r>
-          </w:p>
-        </w:tc>
-        <w:tc>
-          <w:tcPr>
-            <w:tcW w:type="dxa" w:w="4703"/>
-          </w:tcPr>
-          <w:p>
-            <w:r/>
-          </w:p>
-        </w:tc>
-      </w:tr>
-      <w:tr>
-        <w:tc>
-          <w:tcPr>
-            <w:tcW w:type="dxa" w:w="4703"/>
-            <w:shd w:fill="E7E6E6"/>
-          </w:tcPr>
-          <w:p>
-            <w:r>
-              <w:t>職銜 Title</w:t>
-            </w:r>
-          </w:p>
-        </w:tc>
-        <w:tc>
-          <w:tcPr>
-            <w:tcW w:type="dxa" w:w="4703"/>
-          </w:tcPr>
-          <w:p>
-            <w:r/>
-          </w:p>
-        </w:tc>
-      </w:tr>
-      <w:tr>
-        <w:tc>
-          <w:tcPr>
-            <w:tcW w:type="dxa" w:w="4703"/>
-            <w:shd w:fill="E7E6E6"/>
-          </w:tcPr>
-          <w:p>
-            <w:r>
-              <w:t>公司印章 Company Chop</w:t>
-            </w:r>
-          </w:p>
-        </w:tc>
-        <w:tc>
-          <w:tcPr>
-            <w:tcW w:type="dxa" w:w="4703"/>
-          </w:tcPr>
-          <w:p>
-            <w:r>
-              <w:br/>
-              <w:br/>
-              <w:t>（蓋印處）</w:t>
-              <w:br/>
-              <w:br/>
+              <w:rPr>
+                <w:rFonts w:ascii="PMingLiU" w:hAnsi="PMingLiU" w:eastAsia="PMingLiU"/>
+                <w:sz w:val="17"/>
+              </w:rPr>
             </w:r>
           </w:p>
         </w:tc>
@@ -889,64 +1114,144 @@
       <w:tr>
         <w:tc>
           <w:tcPr>
-            <w:tcW w:type="dxa" w:w="4703"/>
+            <w:tcW w:type="dxa" w:w="4986"/>
             <w:shd w:fill="E7E6E6"/>
           </w:tcPr>
           <w:p>
+            <w:pPr>
+              <w:spacing w:before="0" w:after="0" w:lineRule="auto" w:line="252"/>
+            </w:pPr>
             <w:r>
+              <w:rPr>
+                <w:rFonts w:ascii="PMingLiU" w:hAnsi="PMingLiU" w:eastAsia="PMingLiU"/>
+                <w:sz w:val="17"/>
+              </w:rPr>
+              <w:t>姓名 Name／職銜 Title</w:t>
+            </w:r>
+          </w:p>
+        </w:tc>
+        <w:tc>
+          <w:tcPr>
+            <w:tcW w:type="dxa" w:w="4986"/>
+          </w:tcPr>
+          <w:p>
+            <w:pPr>
+              <w:spacing w:before="0" w:after="0" w:lineRule="auto" w:line="252"/>
+            </w:pPr>
+            <w:r>
+              <w:rPr>
+                <w:rFonts w:ascii="PMingLiU" w:hAnsi="PMingLiU" w:eastAsia="PMingLiU"/>
+                <w:sz w:val="17"/>
+              </w:rPr>
+            </w:r>
+          </w:p>
+        </w:tc>
+      </w:tr>
+      <w:tr>
+        <w:tc>
+          <w:tcPr>
+            <w:tcW w:type="dxa" w:w="4986"/>
+            <w:shd w:fill="E7E6E6"/>
+          </w:tcPr>
+          <w:p>
+            <w:pPr>
+              <w:spacing w:before="0" w:after="0" w:lineRule="auto" w:line="252"/>
+            </w:pPr>
+            <w:r>
+              <w:rPr>
+                <w:rFonts w:ascii="PMingLiU" w:hAnsi="PMingLiU" w:eastAsia="PMingLiU"/>
+                <w:sz w:val="17"/>
+              </w:rPr>
+              <w:t>公司印章 Company Chop</w:t>
+            </w:r>
+          </w:p>
+        </w:tc>
+        <w:tc>
+          <w:tcPr>
+            <w:tcW w:type="dxa" w:w="4986"/>
+          </w:tcPr>
+          <w:p>
+            <w:pPr>
+              <w:spacing w:before="0" w:after="0" w:lineRule="auto" w:line="252"/>
+            </w:pPr>
+            <w:r>
+              <w:rPr>
+                <w:rFonts w:ascii="PMingLiU" w:hAnsi="PMingLiU" w:eastAsia="PMingLiU"/>
+                <w:sz w:val="17"/>
+              </w:rPr>
+              <w:t>（蓋印處）</w:t>
+            </w:r>
+          </w:p>
+        </w:tc>
+      </w:tr>
+      <w:tr>
+        <w:tc>
+          <w:tcPr>
+            <w:tcW w:type="dxa" w:w="4986"/>
+            <w:shd w:fill="E7E6E6"/>
+          </w:tcPr>
+          <w:p>
+            <w:pPr>
+              <w:spacing w:before="0" w:after="0" w:lineRule="auto" w:line="252"/>
+            </w:pPr>
+            <w:r>
+              <w:rPr>
+                <w:rFonts w:ascii="PMingLiU" w:hAnsi="PMingLiU" w:eastAsia="PMingLiU"/>
+                <w:sz w:val="17"/>
+              </w:rPr>
               <w:t>日期 Date</w:t>
             </w:r>
           </w:p>
         </w:tc>
         <w:tc>
           <w:tcPr>
-            <w:tcW w:type="dxa" w:w="4703"/>
+            <w:tcW w:type="dxa" w:w="4986"/>
           </w:tcPr>
           <w:p>
-            <w:r/>
+            <w:pPr>
+              <w:spacing w:before="0" w:after="0" w:lineRule="auto" w:line="252"/>
+            </w:pPr>
+            <w:r>
+              <w:rPr>
+                <w:rFonts w:ascii="PMingLiU" w:hAnsi="PMingLiU" w:eastAsia="PMingLiU"/>
+                <w:sz w:val="17"/>
+              </w:rPr>
+            </w:r>
           </w:p>
         </w:tc>
       </w:tr>
     </w:tbl>
-    <w:p/>
-    <w:p/>
     <w:p>
+      <w:pPr>
+        <w:spacing w:before="0" w:after="40" w:lineRule="auto" w:line="259"/>
+      </w:pPr>
       <w:r>
         <w:rPr>
+          <w:rFonts w:ascii="PMingLiU" w:hAnsi="PMingLiU" w:eastAsia="PMingLiU"/>
           <w:b/>
+          <w:i w:val="0"/>
+          <w:sz w:val="20"/>
         </w:rPr>
-        <w:t>Yours faithfully　此致</w:t>
+        <w:t>Yours faithfully　此致　商祺</w:t>
       </w:r>
     </w:p>
     <w:p>
+      <w:pPr>
+        <w:spacing w:before="0" w:after="40" w:lineRule="auto" w:line="259"/>
+      </w:pPr>
       <w:r>
-        <w:t>商祺</w:t>
-      </w:r>
-    </w:p>
-    <w:p/>
-    <w:p>
-      <w:r>
-        <w:t>_________________________</w:t>
-      </w:r>
-    </w:p>
-    <w:p>
-      <w:r>
-        <w:t>（簽署人姓名）</w:t>
-      </w:r>
-    </w:p>
-    <w:p>
-      <w:r>
-        <w:t>（職銜）</w:t>
-      </w:r>
-    </w:p>
-    <w:p>
-      <w:r>
-        <w:t>（公司名稱及印章）</w:t>
+        <w:rPr>
+          <w:rFonts w:ascii="PMingLiU" w:hAnsi="PMingLiU" w:eastAsia="PMingLiU"/>
+          <w:b w:val="0"/>
+          <w:i w:val="0"/>
+          <w:sz w:val="19"/>
+        </w:rPr>
+        <w:t>_________________________　（簽署人姓名、職銜、公司名稱及印章）</w:t>
       </w:r>
     </w:p>
     <w:sectPr>
       <w:pgSz w:w="12240" w:h="15840"/>
-      <w:pgMar w:top="1247" w:right="1417" w:bottom="1247" w:left="1417" w:header="720" w:footer="720" w:gutter="0"/>
+      <w:pgMar w:top="964" w:right="1134" w:bottom="964" w:left="1134" w:header="720" w:footer="720" w:gutter="0"/>
       <w:cols w:space="720"/>
       <w:docGrid w:linePitch="360"/>
     </w:sectPr>
@@ -1317,9 +1622,12 @@
     <w:name w:val="Normal"/>
     <w:qFormat/>
     <w:rsid w:val="00FC693F"/>
+    <w:pPr>
+      <w:spacing w:after="40" w:before="0"/>
+    </w:pPr>
     <w:rPr>
       <w:rFonts w:ascii="PMingLiU" w:hAnsi="PMingLiU" w:eastAsia="PMingLiU"/>
-      <w:sz w:val="22"/>
+      <w:sz w:val="20"/>
     </w:rPr>
   </w:style>
   <w:style w:type="paragraph" w:styleId="Header">

</xml_diff>

<commit_message>
Add full English for section headings (subject line, legal/privacy)
Co-authored-by: Meganheee <Meganheee@users.noreply.github.com>
</commit_message>
<xml_diff>
--- a/HK_Statement_of_Account_Reconciliation_Template.docx
+++ b/HK_Statement_of_Account_Reconciliation_Template.docx
@@ -236,7 +236,7 @@
           <w:i w:val="0"/>
           <w:sz w:val="20"/>
         </w:rPr>
-        <w:t>Re: 主旨</w:t>
+        <w:t>Re: 主旨　Subject</w:t>
       </w:r>
     </w:p>
     <w:p>
@@ -789,7 +789,7 @@
           <w:i w:val="0"/>
           <w:sz w:val="19"/>
         </w:rPr>
-        <w:t>（可選）法律／私隱提示　Optional</w:t>
+        <w:t>（可選）法律／私隱提示　(Optional) Legal and Privacy Notice</w:t>
       </w:r>
     </w:p>
     <w:p>

</xml_diff>

<commit_message>
Clarify opening: letter is for reconciliation only, not payment demand
Co-authored-by: Meganheee <Meganheee@users.noreply.github.com>
</commit_message>
<xml_diff>
--- a/HK_Statement_of_Account_Reconciliation_Template.docx
+++ b/HK_Statement_of_Account_Reconciliation_Template.docx
@@ -278,7 +278,7 @@
           <w:i w:val="0"/>
           <w:sz w:val="19"/>
         </w:rPr>
-        <w:t>本公司為核對雙方帳目及確保記錄一致，謹將截至 ____年____月____日 止貴我雙方往來帳項之結餘列示如下，敬請查核。如與貴司帳冊記錄相符，請於下方「客戶確認」欄簽署及蓋上公司印章（或授權簽章）後，於 ____年____月____日或之前傳真／電郵／郵寄回本司，以便存檔。</w:t>
+        <w:t>本函僅供對帳之用，並非催款。本公司為核對雙方帳目及確保記錄一致，謹將截至 ____年____月____日 止貴我雙方往來帳項之結餘列示如下，敬請查核。如與貴司帳冊記錄相符，請於下方「客戶確認」欄簽署及蓋上公司印章（或授權簽章）後，於 ____年____月____日或之前傳真／電郵／郵寄回本司，以便存檔。</w:t>
       </w:r>
     </w:p>
     <w:p>
@@ -291,7 +291,7 @@
           <w:i/>
           <w:sz w:val="18"/>
         </w:rPr>
-        <w:t>For the purpose of reconciling our records, please find below the balance of our account with you as at [date]. Kindly verify the figures against your books. If the balance agrees with your records, please sign and chop the confirmation section below and return the same to us by fax / email / post on or before [date].</w:t>
+        <w:t>This letter is for reconciliation purposes only and does not constitute a demand for payment. For the purpose of reconciling our records, please find below the balance of our account with you as at [date]. Kindly verify the figures against your books. If the balance agrees with your records, please sign and chop the confirmation section below and return the same to us by fax / email / post on or before [date].</w:t>
       </w:r>
     </w:p>
     <w:p>

</xml_diff>

<commit_message>
Optional legal notice: lead with reconciliation-only, not payment demand
Co-authored-by: Meganheee <Meganheee@users.noreply.github.com>
</commit_message>
<xml_diff>
--- a/HK_Statement_of_Account_Reconciliation_Template.docx
+++ b/HK_Statement_of_Account_Reconciliation_Template.docx
@@ -803,7 +803,7 @@
           <w:i w:val="0"/>
           <w:sz w:val="17"/>
         </w:rPr>
-        <w:t>1）「視為確認」類條款可能具法律效果，採用前請內部法務／律師審閱。2）聯絡資料僅作對帳用途，並按香港《個人資料（私隱）條例》處理。</w:t>
+        <w:t>1）本函僅供對帳之用，並非催款；如涉及「視為確認」類條款，仍可能具法律效果，採用前請內部法務／律師審閱。2）聯絡資料僅作對帳用途，並按香港《個人資料（私隱）條例》處理。</w:t>
       </w:r>
     </w:p>
     <w:p>
@@ -816,7 +816,7 @@
           <w:i/>
           <w:sz w:val="16"/>
         </w:rPr>
-        <w:t>Note: (1) Any “deemed acceptance” or similar wording may have legal effect — obtain internal legal / lawyer review before use. (2) Contact details herein are for reconciliation purposes only and will be handled in accordance with the Personal Data (Privacy) Ordinance (Cap. 486) of Hong Kong.</w:t>
+        <w:t>Note: (1) This letter is for reconciliation purposes only and does not constitute a demand for payment. Any “deemed acceptance” or similar wording may nevertheless have legal effect — obtain internal legal / lawyer review before use. (2) Contact details herein are for reconciliation purposes only and will be handled in accordance with the Personal Data (Privacy) Ordinance (Cap. 486) of Hong Kong.</w:t>
       </w:r>
     </w:p>
     <w:p>

</xml_diff>

<commit_message>
Add deemed confirmation if no written objection by deadline
Co-authored-by: Meganheee <Meganheee@users.noreply.github.com>
</commit_message>
<xml_diff>
--- a/HK_Statement_of_Account_Reconciliation_Template.docx
+++ b/HK_Statement_of_Account_Reconciliation_Template.docx
@@ -278,7 +278,7 @@
           <w:i w:val="0"/>
           <w:sz w:val="19"/>
         </w:rPr>
-        <w:t>本函僅供對帳之用，並非催款。本公司為核對雙方帳目及確保記錄一致，謹將截至 ____年____月____日 止貴我雙方往來帳項之結餘列示如下，敬請查核。如與貴司帳冊記錄相符，請於下方「客戶確認」欄簽署及蓋上公司印章（或授權簽章）後，於 ____年____月____日或之前傳真／電郵／郵寄回本司，以便存檔。</w:t>
+        <w:t>本函僅供對帳之用，並非催款。本公司為核對雙方帳目及確保記錄一致，謹將截至 ____年____月____日 止貴我雙方往來帳項之結餘列示如下，敬請查核。如與貴司帳冊記錄相符，請於下方「客戶確認」欄簽署及蓋上公司印章（或授權簽章）後，於 ____年____月____日或之前傳真／電郵／郵寄回本司，以便存檔。倘於上述期限前未接獲貴司書面異議，則視為貴司確認上述結餘金額無誤。</w:t>
       </w:r>
     </w:p>
     <w:p>
@@ -291,7 +291,7 @@
           <w:i/>
           <w:sz w:val="18"/>
         </w:rPr>
-        <w:t>This letter is for reconciliation purposes only and does not constitute a demand for payment. For the purpose of reconciling our records, please find below the balance of our account with you as at [date]. Kindly verify the figures against your books. If the balance agrees with your records, please sign and chop the confirmation section below and return the same to us by fax / email / post on or before [date].</w:t>
+        <w:t>This letter is for reconciliation purposes only and does not constitute a demand for payment. For the purpose of reconciling our records, please find below the balance of our account with you as at [date]. Kindly verify the figures against your books. If the balance agrees with your records, please sign and chop the confirmation section below and return the same to us by fax / email / post on or before [date]. If no written objection is received from you by the aforesaid date, you shall be deemed to have confirmed that the balance stated above is correct.</w:t>
       </w:r>
     </w:p>
     <w:p>

</xml_diff>

<commit_message>
Wording: 下述結餘 (balance stated below)
Co-authored-by: Meganheee <Meganheee@users.noreply.github.com>
</commit_message>
<xml_diff>
--- a/HK_Statement_of_Account_Reconciliation_Template.docx
+++ b/HK_Statement_of_Account_Reconciliation_Template.docx
@@ -278,7 +278,7 @@
           <w:i w:val="0"/>
           <w:sz w:val="19"/>
         </w:rPr>
-        <w:t>本函僅供對帳之用，並非催款。本公司為核對雙方帳目及確保記錄一致，謹將截至 ____年____月____日 止貴我雙方往來帳項之結餘列示如下，敬請查核。如與貴司帳冊記錄相符，請於下方「客戶確認」欄簽署及蓋上公司印章（或授權簽章）後，於 ____年____月____日或之前傳真／電郵／郵寄回本司，以便存檔。倘於上述期限前未接獲貴司書面異議，則視為貴司確認上述結餘金額無誤。</w:t>
+        <w:t>本函僅供對帳之用，並非催款。本公司為核對雙方帳目及確保記錄一致，謹將截至 ____年____月____日 止貴我雙方往來帳項之結餘列示如下，敬請查核。如與貴司帳冊記錄相符，請於下方「客戶確認」欄簽署及蓋上公司印章（或授權簽章）後，於 ____年____月____日或之前傳真／電郵／郵寄回本司，以便存檔。倘於上述期限前未接獲貴司書面異議，則視為貴司確認下述結餘金額無誤。</w:t>
       </w:r>
     </w:p>
     <w:p>
@@ -291,7 +291,7 @@
           <w:i/>
           <w:sz w:val="18"/>
         </w:rPr>
-        <w:t>This letter is for reconciliation purposes only and does not constitute a demand for payment. For the purpose of reconciling our records, please find below the balance of our account with you as at [date]. Kindly verify the figures against your books. If the balance agrees with your records, please sign and chop the confirmation section below and return the same to us by fax / email / post on or before [date]. If no written objection is received from you by the aforesaid date, you shall be deemed to have confirmed that the balance stated above is correct.</w:t>
+        <w:t>This letter is for reconciliation purposes only and does not constitute a demand for payment. For the purpose of reconciling our records, please find below the balance of our account with you as at [date]. Kindly verify the figures against your books. If the balance agrees with your records, please sign and chop the confirmation section below and return the same to us by fax / email / post on or before [date]. If no written objection is received from you by the aforesaid date, you shall be deemed to have confirmed that the balance stated below is correct.</w:t>
       </w:r>
     </w:p>
     <w:p>

</xml_diff>